<commit_message>
adapters: ship GENERIC renderers with the adapter (docx/xlsx); drop instance scripts
Renderers must be universal/instance-agnostic (no product data) so they travel with
the framework and keep the base neutral. to-document/render.py (markdown -> styled
.docx) and to-table/render.py (markdown tables from any instance -> .xlsx/CSV) now live
in the adapter folders; the decksmith-specific renderers/ folder is removed. Adapters
stay instruction-skills by default; a render.py ships ONLY where a library is required.

Co-Authored-By: Claude Opus 4.8 (1M context) <noreply@anthropic.com>
</commit_message>
<xml_diff>
--- a/examples/decksmith/deliverables/concept-brief.docx
+++ b/examples/decksmith/deliverables/concept-brief.docx
@@ -28,13 +28,16 @@
       </w:r>
     </w:p>
     <w:p>
+      <w:pPr>
+        <w:spacing w:after="20"/>
+      </w:pPr>
       <w:r>
         <w:rPr>
           <w:rFonts w:ascii="Consolas" w:hAnsi="Consolas"/>
           <w:color w:val="5B6470"/>
           <w:sz w:val="17"/>
         </w:rPr>
-        <w:t>Status: concept-viability   ·   July 2026   ·   fictional sample</w:t>
+        <w:t>Status: concept-viability · July 2026 · fictional sample</w:t>
       </w:r>
     </w:p>
     <w:p>
@@ -62,6 +65,9 @@
     </w:p>
     <w:p>
       <w:r>
+        <w:rPr>
+          <w:b w:val="0"/>
+        </w:rPr>
         <w:t>An AI tool that generates a full presentation and exports it as a native .pptx / .key file where every object stays genuinely editable and genuinely designed — not a picture of a slide, and not an obvious template.</w:t>
       </w:r>
     </w:p>
@@ -82,6 +88,9 @@
     </w:p>
     <w:p>
       <w:r>
+        <w:rPr>
+          <w:b w:val="0"/>
+        </w:rPr>
         <w:t>A salesperson prepping a client pitch under time pressure wants a deck that's ready to send, not a draft to rebuild. Today's AI decks fail three ways:</w:t>
       </w:r>
     </w:p>
@@ -93,12 +102,14 @@
       <w:r>
         <w:rPr>
           <w:b/>
-          <w:color w:val="14171D"/>
         </w:rPr>
-        <w:t xml:space="preserve">Looks templated — </w:t>
+        <w:t>Looks templated</w:t>
       </w:r>
       <w:r>
-        <w:t>generic, off-brand output that reads “made by AI” at a glance (P1).</w:t>
+        <w:rPr>
+          <w:b w:val="0"/>
+        </w:rPr>
+        <w:t xml:space="preserve"> — generic, off-brand output that reads "made by AI" at a glance (P1).</w:t>
       </w:r>
     </w:p>
     <w:p>
@@ -109,12 +120,14 @@
       <w:r>
         <w:rPr>
           <w:b/>
-          <w:color w:val="14171D"/>
         </w:rPr>
-        <w:t xml:space="preserve">Wrong structure — </w:t>
+        <w:t>Wrong structure</w:t>
       </w:r>
       <w:r>
-        <w:t>passable visuals wrapped around the wrong argument and framing (P2).</w:t>
+        <w:rPr>
+          <w:b w:val="0"/>
+        </w:rPr>
+        <w:t xml:space="preserve"> — passable visuals wrapped around the wrong argument and framing (P2).</w:t>
       </w:r>
     </w:p>
     <w:p>
@@ -125,12 +138,14 @@
       <w:r>
         <w:rPr>
           <w:b/>
-          <w:color w:val="14171D"/>
         </w:rPr>
-        <w:t xml:space="preserve">Can't edit it — </w:t>
+        <w:t>Can't edit it</w:t>
       </w:r>
       <w:r>
-        <w:t>export lands as flattened images, so the deck gets redone by hand — the killer.</w:t>
+        <w:rPr>
+          <w:b w:val="0"/>
+        </w:rPr>
+        <w:t xml:space="preserve"> — export lands as flattened images, so the deck gets redone by hand — the killer.</w:t>
       </w:r>
     </w:p>
     <w:p>
@@ -150,16 +165,21 @@
     </w:p>
     <w:p>
       <w:r>
+        <w:rPr>
+          <w:b w:val="0"/>
+        </w:rPr>
         <w:t xml:space="preserve">Every AI deck tool is web-first. </w:t>
       </w:r>
       <w:r>
         <w:rPr>
           <w:b/>
-          <w:color w:val="C02A22"/>
         </w:rPr>
         <w:t>30–40% of slides are flattened to images when Gamma exports to .pptx</w:t>
       </w:r>
       <w:r>
+        <w:rPr>
+          <w:b w:val="0"/>
+        </w:rPr>
         <w:t xml:space="preserve"> [sourced: market-research]. The unclaimed ground is native fidelity — a downloaded file that stays fully editable in PowerPoint and Keynote.</w:t>
       </w:r>
     </w:p>
@@ -186,12 +206,14 @@
       <w:r>
         <w:rPr>
           <w:b/>
-          <w:color w:val="14171D"/>
         </w:rPr>
-        <w:t xml:space="preserve">Size — </w:t>
+        <w:t>Size</w:t>
       </w:r>
       <w:r>
-        <w:t>~$750M obtainable SAM, bottom-up from reachable segments [assumption].</w:t>
+        <w:rPr>
+          <w:b w:val="0"/>
+        </w:rPr>
+        <w:t xml:space="preserve"> — ~$750M obtainable SAM, bottom-up from reachable segments [assumption].</w:t>
       </w:r>
     </w:p>
     <w:p>
@@ -202,12 +224,14 @@
       <w:r>
         <w:rPr>
           <w:b/>
-          <w:color w:val="14171D"/>
         </w:rPr>
-        <w:t xml:space="preserve">Who's here — </w:t>
+        <w:t>Who's here</w:t>
       </w:r>
       <w:r>
-        <w:t>Gamma, Microsoft Copilot, Canva, Beautiful.ai, Pitch, Tome.</w:t>
+        <w:rPr>
+          <w:b w:val="0"/>
+        </w:rPr>
+        <w:t xml:space="preserve"> — Gamma, Microsoft Copilot, Canva, Beautiful.ai, Pitch, Tome.</w:t>
       </w:r>
     </w:p>
     <w:p>
@@ -218,12 +242,14 @@
       <w:r>
         <w:rPr>
           <w:b/>
-          <w:color w:val="14171D"/>
         </w:rPr>
-        <w:t xml:space="preserve">The threat — </w:t>
+        <w:t>The threat</w:t>
       </w:r>
       <w:r>
-        <w:t>Copilot and Canva are entering the same wedge — so the moat must be the fidelity + design engine, not the app around it.</w:t>
+        <w:rPr>
+          <w:b w:val="0"/>
+        </w:rPr>
+        <w:t xml:space="preserve"> — Copilot and Canva are entering the same wedge; the moat must be the fidelity + design engine, not the app.</w:t>
       </w:r>
     </w:p>
     <w:p>
@@ -249,12 +275,14 @@
       <w:r>
         <w:rPr>
           <w:b/>
-          <w:color w:val="14171D"/>
         </w:rPr>
-        <w:t xml:space="preserve">Beachhead — </w:t>
+        <w:t>Beachhead</w:t>
       </w:r>
       <w:r>
-        <w:t>salespeople prepping a client pitch under deadline — a sharp, reachable job.</w:t>
+        <w:rPr>
+          <w:b w:val="0"/>
+        </w:rPr>
+        <w:t xml:space="preserve"> — salespeople prepping a client pitch under deadline; a sharp, reachable job.</w:t>
       </w:r>
     </w:p>
     <w:p>
@@ -265,12 +293,14 @@
       <w:r>
         <w:rPr>
           <w:b/>
-          <w:color w:val="14171D"/>
         </w:rPr>
-        <w:t xml:space="preserve">Positioning — </w:t>
+        <w:t>Positioning</w:t>
       </w:r>
       <w:r>
-        <w:t>“actually-editable + designed native decks” — a wedge strong enough to beat the PowerPoint habit.</w:t>
+        <w:rPr>
+          <w:b w:val="0"/>
+        </w:rPr>
+        <w:t xml:space="preserve"> — "actually-editable + designed native decks", a wedge strong enough to beat the PowerPoint habit.</w:t>
       </w:r>
     </w:p>
     <w:p>
@@ -281,12 +311,14 @@
       <w:r>
         <w:rPr>
           <w:b/>
-          <w:color w:val="14171D"/>
         </w:rPr>
-        <w:t xml:space="preserve">Pricing — </w:t>
+        <w:t>Pricing</w:t>
       </w:r>
       <w:r>
-        <w:t>$15–25 / mo standalone — an open willingness-to-pay hypothesis, not a set price.</w:t>
+        <w:rPr>
+          <w:b w:val="0"/>
+        </w:rPr>
+        <w:t xml:space="preserve"> — $15–25 / mo standalone; an open willingness-to-pay hypothesis, not a set price.</w:t>
       </w:r>
     </w:p>
     <w:p>
@@ -312,12 +344,14 @@
       <w:r>
         <w:rPr>
           <w:b/>
-          <w:color w:val="14171D"/>
         </w:rPr>
-        <w:t xml:space="preserve">The gate metric — </w:t>
+        <w:t>The gate metric</w:t>
       </w:r>
       <w:r>
-        <w:t>edit-fidelity ≥ 90% of exported objects natively editable (M-edit-fidelity) — the concept-proving read.</w:t>
+        <w:rPr>
+          <w:b w:val="0"/>
+        </w:rPr>
+        <w:t xml:space="preserve"> — edit-fidelity ≥ 90% of exported objects natively editable (M-edit-fidelity), the concept-proving read.</w:t>
       </w:r>
     </w:p>
     <w:p>
@@ -328,12 +362,14 @@
       <w:r>
         <w:rPr>
           <w:b/>
-          <w:color w:val="14171D"/>
         </w:rPr>
-        <w:t xml:space="preserve">Guardrail — </w:t>
+        <w:t>Guardrail</w:t>
       </w:r>
       <w:r>
-        <w:t>COGS ≤ $1 / deck (LLM inference is a cost line). Red line: no flatten-to-image shortcut — it would fake the entire wedge.</w:t>
+        <w:rPr>
+          <w:b w:val="0"/>
+        </w:rPr>
+        <w:t xml:space="preserve"> — COGS ≤ $1 / deck. Red line: no flatten-to-image shortcut — it would fake the entire wedge.</w:t>
       </w:r>
     </w:p>
     <w:p>
@@ -353,6 +389,9 @@
     </w:p>
     <w:p>
       <w:r>
+        <w:rPr>
+          <w:b w:val="0"/>
+        </w:rPr>
         <w:t>A 6-week Concept Test with one learning goal: can we build native edit-fidelity at scale (H-001)? Sprint 1 ships a thin export slice, a fidelity harness, and a cheap demand probe. Decision rule is pre-registered:</w:t>
       </w:r>
     </w:p>
@@ -532,7 +571,7 @@
             <w:r>
               <w:rPr>
                 <w:rFonts w:ascii="Calibri" w:hAnsi="Calibri"/>
-                <w:b/>
+                <w:b w:val="0"/>
                 <w:color w:val="14171D"/>
                 <w:sz w:val="19"/>
               </w:rPr>
@@ -614,7 +653,7 @@
             <w:r>
               <w:rPr>
                 <w:rFonts w:ascii="Calibri" w:hAnsi="Calibri"/>
-                <w:b/>
+                <w:b w:val="0"/>
                 <w:color w:val="14171D"/>
                 <w:sz w:val="19"/>
               </w:rPr>
@@ -624,14 +663,6 @@
         </w:tc>
       </w:tr>
     </w:tbl>
-    <w:p>
-      <w:pPr>
-        <w:spacing w:before="40" w:after="80"/>
-        <w:pBdr>
-          <w:bottom w:val="single" w:sz="14" w:space="1" w:color="1D46D6"/>
-        </w:pBdr>
-      </w:pPr>
-    </w:p>
     <w:sectPr>
       <w:footerReference w:type="default" r:id="rId9"/>
       <w:pgSz w:w="12240" w:h="15840"/>

</xml_diff>